<commit_message>
Sanitize repository: remove company specific references
</commit_message>
<xml_diff>
--- a/backend/templates/Annual Maintenance Contract.docx
+++ b/backend/templates/Annual Maintenance Contract.docx
@@ -11,7 +11,7 @@
           <w:b/>
           <w:sz w:val="32"/>
         </w:rPr>
-        <w:t>MSD AGREEMENT</w:t>
+        <w:t>COMMERCIAL AGREEMENT</w:t>
       </w:r>
     </w:p>
     <w:p>
@@ -37,7 +37,7 @@
     </w:p>
     <w:p>
       <w:r>
-        <w:t>This Agreement is made on {{agreement_start_date}} between MSD and:</w:t>
+        <w:t>This Agreement is made on {{agreement_start_date}} between the Company and:</w:t>
       </w:r>
     </w:p>
     <w:p>
@@ -138,7 +138,7 @@
           </w:tcPr>
           <w:p>
             <w:r>
-              <w:t>For MSD:</w:t>
+              <w:t>For Authorized Signatory:</w:t>
             </w:r>
           </w:p>
         </w:tc>

</xml_diff>